<commit_message>
Add Modify Labels repair to MOSt next steps
</commit_message>
<xml_diff>
--- a/verified_v16_14_installers/MOSt_V16.14_Development_Record_and_Next_Steps.docx
+++ b/verified_v16_14_installers/MOSt_V16.14_Development_Record_and_Next_Steps.docx
@@ -508,7 +508,7 @@
           </w:tcPr>
           <w:p>
             <w:r>
-              <w:t>Medication prescriptions</w:t>
+              <w:t>Modify Labels</w:t>
             </w:r>
           </w:p>
         </w:tc>
@@ -519,7 +519,7 @@
           </w:tcPr>
           <w:p>
             <w:r>
-              <w:t>Structured prescription entry with medication, strength, route, directions, quantity, repeats, dates, prescriber, status, and printable/PDF output. Preserve an immutable issued copy and support discontinue/reissue instead of overwriting.</w:t>
+              <w:t>Repair the Modify Labels function so existing label layouts can be opened, changed, saved, and used without freezing, read-only behavior, missing controls, or damage to shared label data.</w:t>
             </w:r>
           </w:p>
         </w:tc>
@@ -530,7 +530,7 @@
           </w:tcPr>
           <w:p>
             <w:r>
-              <w:t>Create, preview, print/PDF, reissue, discontinue, and retrieve a test prescription; required-field and interaction-warning behavior agreed by clinicians.</w:t>
+              <w:t>Change label text, field selection, font, spacing, and position; save and reopen the layout; preview and print representative patient and mailing labels; confirm the result from XP and Windows 10 or 11 workstations.</w:t>
             </w:r>
           </w:p>
         </w:tc>
@@ -556,7 +556,7 @@
           </w:tcPr>
           <w:p>
             <w:r>
-              <w:t>Eyeglass prescriptions</w:t>
+              <w:t>Medication prescriptions</w:t>
             </w:r>
           </w:p>
         </w:tc>
@@ -568,7 +568,7 @@
           </w:tcPr>
           <w:p>
             <w:r>
-              <w:t>Dedicated optical prescription form for OD/OS sphere, cylinder, axis, prism/base, add, pupillary distance, expiry/review date, notes, prescriber, and printable/PDF output.</w:t>
+              <w:t>Structured prescription entry with medication, strength, route, directions, quantity, repeats, dates, prescriber, status, and printable/PDF output. Preserve an immutable issued copy and support discontinue/reissue instead of overwriting.</w:t>
             </w:r>
           </w:p>
         </w:tc>
@@ -580,7 +580,7 @@
           </w:tcPr>
           <w:p>
             <w:r>
-              <w:t>Validated sample prescriptions, correct sign convention and formatting, patient/prescriber identity, and past optical prescription retrieval.</w:t>
+              <w:t>Create, preview, print/PDF, reissue, discontinue, and retrieve a test prescription; required-field and interaction-warning behavior agreed by clinicians.</w:t>
             </w:r>
           </w:p>
         </w:tc>
@@ -604,7 +604,7 @@
           </w:tcPr>
           <w:p>
             <w:r>
-              <w:t>Past prescription view</w:t>
+              <w:t>Eyeglass prescriptions</w:t>
             </w:r>
           </w:p>
         </w:tc>
@@ -615,7 +615,7 @@
           </w:tcPr>
           <w:p>
             <w:r>
-              <w:t>A patient-level Prescription History tab combining medication and optical items. Default newest-first with filters for type, date, prescriber, active/discontinued, and a View/Print/Reissue action. Never mix draft and issued versions without a clear status.</w:t>
+              <w:t>Dedicated optical prescription form for OD/OS sphere, cylinder, axis, prism/base, add, pupillary distance, expiry/review date, notes, prescriber, and printable/PDF output.</w:t>
             </w:r>
           </w:p>
         </w:tc>
@@ -626,7 +626,7 @@
           </w:tcPr>
           <w:p>
             <w:r>
-              <w:t>Find a past item in three clicks or fewer; display original issued content, status, related reissue, and audit history.</w:t>
+              <w:t>Validated sample prescriptions, correct sign convention and formatting, patient/prescriber identity, and past optical prescription retrieval.</w:t>
             </w:r>
           </w:p>
         </w:tc>
@@ -652,7 +652,7 @@
           </w:tcPr>
           <w:p>
             <w:r>
-              <w:t>Document change tracking</w:t>
+              <w:t>Past prescription view</w:t>
             </w:r>
           </w:p>
         </w:tc>
@@ -664,7 +664,7 @@
           </w:tcPr>
           <w:p>
             <w:r>
-              <w:t>Append-only audit log for create, edit, print, export, void, reissue, and delete attempts. Record patient/document ID, version, user, workstation, date/time, action, reason, and before/after field changes. Restrict audit viewing by role and make normal users unable to edit it.</w:t>
+              <w:t>A patient-level Prescription History tab combining medication and optical items. Default newest-first with filters for type, date, prescriber, active/discontinued, and a View/Print/Reissue action. Never mix draft and issued versions without a clear status.</w:t>
             </w:r>
           </w:p>
         </w:tc>
@@ -676,7 +676,7 @@
           </w:tcPr>
           <w:p>
             <w:r>
-              <w:t>Demonstrate complete history, reason capture, role restrictions, clock/user accuracy, backup inclusion, and an audit export for review.</w:t>
+              <w:t>Find a past item in three clicks or fewer; display original issued content, status, related reissue, and audit history.</w:t>
             </w:r>
           </w:p>
         </w:tc>
@@ -700,7 +700,7 @@
           </w:tcPr>
           <w:p>
             <w:r>
-              <w:t>EDT Ministry exchange</w:t>
+              <w:t>Document change tracking</w:t>
             </w:r>
           </w:p>
         </w:tc>
@@ -711,7 +711,7 @@
           </w:tcPr>
           <w:p>
             <w:r>
-              <w:t>Server-only EDT console with the existing 'Are you on the server?' guard, credential handling that does not store plain-text passwords, upload/download status, duplicate prevention, archive folders, reconciliation, and clear retry/error reporting.</w:t>
+              <w:t>Append-only audit log for create, edit, print, export, void, reissue, and delete attempts. Record patient/document ID, version, user, workstation, date/time, action, reason, and before/after field changes. Restrict audit viewing by role and make normal users unable to edit it.</w:t>
             </w:r>
           </w:p>
         </w:tc>
@@ -722,7 +722,7 @@
           </w:tcPr>
           <w:p>
             <w:r>
-              <w:t>Test upload, acknowledgement, download, duplicate rejection, interrupted transfer recovery, reconciliation, permissions, and server IN/OUT placement using Ministry-approved test data.</w:t>
+              <w:t>Demonstrate complete history, reason capture, role restrictions, clock/user accuracy, backup inclusion, and an audit export for review.</w:t>
             </w:r>
           </w:p>
         </w:tc>
@@ -748,7 +748,7 @@
           </w:tcPr>
           <w:p>
             <w:r>
-              <w:t>Further updates</w:t>
+              <w:t>EDT Ministry exchange</w:t>
             </w:r>
           </w:p>
         </w:tc>
@@ -760,6 +760,53 @@
           </w:tcPr>
           <w:p>
             <w:r>
+              <w:t>Server-only EDT console with the existing 'Are you on the server?' guard, credential handling that does not store plain-text passwords, upload/download status, duplicate prevention, archive folders, reconciliation, and clear retry/error reporting.</w:t>
+            </w:r>
+          </w:p>
+        </w:tc>
+        <w:tc>
+          <w:tcPr>
+            <w:tcW w:type="dxa" w:w="3024"/>
+            <w:vAlign w:val="center"/>
+            <w:shd w:fill="EAF2F8"/>
+          </w:tcPr>
+          <w:p>
+            <w:r>
+              <w:t>Test upload, acknowledgement, download, duplicate rejection, interrupted transfer recovery, reconciliation, permissions, and server IN/OUT placement using Ministry-approved test data.</w:t>
+            </w:r>
+          </w:p>
+        </w:tc>
+      </w:tr>
+      <w:tr>
+        <w:tc>
+          <w:tcPr>
+            <w:tcW w:type="dxa" w:w="792"/>
+            <w:vAlign w:val="center"/>
+          </w:tcPr>
+          <w:p>
+            <w:r>
+              <w:t>7</w:t>
+            </w:r>
+          </w:p>
+        </w:tc>
+        <w:tc>
+          <w:tcPr>
+            <w:tcW w:type="dxa" w:w="1800"/>
+            <w:vAlign w:val="center"/>
+          </w:tcPr>
+          <w:p>
+            <w:r>
+              <w:t>Further updates</w:t>
+            </w:r>
+          </w:p>
+        </w:tc>
+        <w:tc>
+          <w:tcPr>
+            <w:tcW w:type="dxa" w:w="5544"/>
+            <w:vAlign w:val="center"/>
+          </w:tcPr>
+          <w:p>
+            <w:r>
               <w:t>Review defects and requests discovered during the pilot, prioritize by patient safety, billing accuracy, data integrity, and workflow impact, then label the next incremental test release.</w:t>
             </w:r>
           </w:p>
@@ -768,7 +815,6 @@
           <w:tcPr>
             <w:tcW w:type="dxa" w:w="3024"/>
             <w:vAlign w:val="center"/>
-            <w:shd w:fill="EAF2F8"/>
           </w:tcPr>
           <w:p>
             <w:r>

</xml_diff>